<commit_message>
MIT license and an industry- and location-neutral Example Corp persona
LICENSE follows the org convention (MIT, AI quickstart). The sample
documents keep the Example Corp name but no longer tie it to an industry
or to specific countries and cities: head office and regional offices,
local law, fictional addresses; the managed-services contract now has
Example Corp as the client. EUR amounts unchanged. README industry tag is
Cross-industry. Rendered DOCX and PDF files rebuilt.

Co-Authored-By: Claude Fable 5.1 <noreply@anthropic.com>
</commit_message>
<xml_diff>
--- a/data/sample-docs/contract-managed-services-blue-harbor.docx
+++ b/data/sample-docs/contract-managed-services-blue-harbor.docx
@@ -26,7 +26,13 @@
         <w:t xml:space="preserve"> </w:t>
       </w:r>
       <w:r>
-        <w:t xml:space="preserve">Example Corp B.V., 200 Example Plaza, 1017 AB Amsterdam, the Netherlands</w:t>
+        <w:t xml:space="preserve">Blue Harbor IT Services Ltd., 19 Quayside, Harbour City (</w:t>
+      </w:r>
+      <w:r>
+        <w:t xml:space="preserve">“Blue Harbor”</w:t>
+      </w:r>
+      <w:r>
+        <w:t xml:space="preserve">)</w:t>
       </w:r>
       <w:r>
         <w:t xml:space="preserve"> </w:t>
@@ -42,7 +48,13 @@
         <w:t xml:space="preserve"> </w:t>
       </w:r>
       <w:r>
-        <w:t xml:space="preserve">Blue Harbor Logistics B.V., Waalhaven Zuidzijde 19, 3089 JH Rotterdam, the Netherlands</w:t>
+        <w:t xml:space="preserve">Example Corp, 200 Example Plaza, Example City (</w:t>
+      </w:r>
+      <w:r>
+        <w:t xml:space="preserve">“Example Corp”</w:t>
+      </w:r>
+      <w:r>
+        <w:t xml:space="preserve">)</w:t>
       </w:r>
     </w:p>
     <w:p>
@@ -93,7 +105,7 @@
         <w:pStyle w:val="FirstParagraph"/>
       </w:pPr>
       <w:r>
-        <w:t xml:space="preserve">Example Corp provides the following managed IT services to the Client:</w:t>
+        <w:t xml:space="preserve">Blue Harbor provides the following managed IT services to Example Corp:</w:t>
       </w:r>
     </w:p>
     <w:p>
@@ -105,7 +117,7 @@
         </w:numPr>
       </w:pPr>
       <w:r>
-        <w:t xml:space="preserve">Service desk for the Client’s 240 users, Monday to Friday 08:00 to 18:00 CET (8x5), by phone, email, and portal.</w:t>
+        <w:t xml:space="preserve">Service desk for Example Corp’s 240 users, Monday to Friday 08:00 to 18:00 local time (8x5), by phone, email, and portal.</w:t>
       </w:r>
     </w:p>
     <w:p>
@@ -117,7 +129,7 @@
         </w:numPr>
       </w:pPr>
       <w:r>
-        <w:t xml:space="preserve">Monitoring of the Client’s servers, network, and cloud workloads 24 hours a day, 7 days a week (24x7), with automated alerting.</w:t>
+        <w:t xml:space="preserve">Monitoring of Example Corp’s servers, network, and cloud workloads 24 hours a day, 7 days a week (24x7), with automated alerting.</w:t>
       </w:r>
     </w:p>
     <w:p>
@@ -431,7 +443,7 @@
         <w:t xml:space="preserve">99.5 percent</w:t>
       </w:r>
       <w:r>
-        <w:t xml:space="preserve">, excluding agreed maintenance windows. Service credits are capped at 20 percent of the monthly fee and are the Client’s sole remedy for missed service levels.</w:t>
+        <w:t xml:space="preserve">, excluding agreed maintenance windows. Service credits are capped at 20 percent of the monthly fee and are Example Corp’s sole remedy for missed service levels.</w:t>
       </w:r>
     </w:p>
     <w:bookmarkEnd w:id="10"/>
@@ -469,7 +481,7 @@
         <w:t xml:space="preserve"> </w:t>
       </w:r>
       <w:r>
-        <w:t xml:space="preserve">excluding VAT, invoiced monthly in advance, payable within 30 days.</w:t>
+        <w:t xml:space="preserve">excluding sales tax, invoiced monthly in advance, payable within 30 days.</w:t>
       </w:r>
     </w:p>
     <w:p>
@@ -493,7 +505,7 @@
         </w:numPr>
       </w:pPr>
       <w:r>
-        <w:t xml:space="preserve">Fees may be adjusted once per year on the anniversary of the effective date by the Dutch consumer price index, with 60 days’ notice.</w:t>
+        <w:t xml:space="preserve">Fees may be adjusted once per year on the anniversary of the effective date by the consumer price index published in the Provider’s home jurisdiction, with 60 days’ notice.</w:t>
       </w:r>
     </w:p>
     <w:bookmarkEnd w:id="11"/>
@@ -552,7 +564,7 @@
         </w:numPr>
       </w:pPr>
       <w:r>
-        <w:t xml:space="preserve">On termination Example Corp provides exit assistance for up to 60 days at the rate card and returns or deletes Client data within 30 days.</w:t>
+        <w:t xml:space="preserve">On termination Blue Harbor provides exit assistance for up to 60 days at the rate card and returns or deletes Example Corp data within 30 days.</w:t>
       </w:r>
     </w:p>
     <w:bookmarkEnd w:id="12"/>
@@ -570,7 +582,7 @@
         <w:pStyle w:val="FirstParagraph"/>
       </w:pPr>
       <w:r>
-        <w:t xml:space="preserve">The Client provides access to systems and premises as needed, names a primary contact, and keeps software licences current. The Client remains responsible for its own data and backups of systems outside the scope.</w:t>
+        <w:t xml:space="preserve">Example Corp provides access to systems and premises as needed, names a primary contact, and keeps software licences current. Example Corp remains responsible for its own data and backups of systems outside the scope.</w:t>
       </w:r>
     </w:p>
     <w:bookmarkEnd w:id="13"/>
@@ -588,7 +600,7 @@
         <w:pStyle w:val="FirstParagraph"/>
       </w:pPr>
       <w:r>
-        <w:t xml:space="preserve">Example Corp processes personal data only on the Client’s instructions under the data processing agreement in Annex C. Sub-processors are listed in Annex C and updated with 30 days’ notice.</w:t>
+        <w:t xml:space="preserve">Blue Harbor processes personal data only on Example Corp’s instructions under the data processing agreement in Annex C. Sub-processors are listed in Annex C and updated with 30 days’ notice.</w:t>
       </w:r>
     </w:p>
     <w:bookmarkEnd w:id="14"/>
@@ -606,7 +618,7 @@
         <w:pStyle w:val="FirstParagraph"/>
       </w:pPr>
       <w:r>
-        <w:t xml:space="preserve">Example Corp’s total liability under this agreement is limited to the fees paid in the</w:t>
+        <w:t xml:space="preserve">Blue Harbor’s total liability under this agreement is limited to the fees paid in the</w:t>
       </w:r>
       <w:r>
         <w:t xml:space="preserve"> </w:t>
@@ -640,7 +652,7 @@
         <w:pStyle w:val="FirstParagraph"/>
       </w:pPr>
       <w:r>
-        <w:t xml:space="preserve">The laws of the Netherlands apply. Disputes are submitted to the court in Rotterdam.</w:t>
+        <w:t xml:space="preserve">The law of the jurisdiction in which Example Corp has its registered seat applies. Disputes are submitted to the competent court there.</w:t>
       </w:r>
     </w:p>
     <w:bookmarkEnd w:id="16"/>
@@ -658,13 +670,13 @@
         <w:pStyle w:val="FirstParagraph"/>
       </w:pPr>
       <w:r>
-        <w:t xml:space="preserve">For Example Corp B.V.: Dana Whitfield, Chief Information Officer, 20 February 2026</w:t>
+        <w:t xml:space="preserve">For Blue Harbor IT Services Ltd.: Ruben de Vries, Operations Director, 20 February 2026</w:t>
       </w:r>
       <w:r>
         <w:t xml:space="preserve"> </w:t>
       </w:r>
       <w:r>
-        <w:t xml:space="preserve">For Blue Harbor Logistics B.V.: Ruben de Vries, Operations Director, 24 February 2026</w:t>
+        <w:t xml:space="preserve">For Example Corp: Dana Whitfield, Chief Information Officer, 24 February 2026</w:t>
       </w:r>
     </w:p>
     <w:p>

</xml_diff>